<commit_message>
PAUSED (task177): stage 3 green, stakeholder role redrawn after the window moved, waiting on the readers and judge
task178 v3 was marked spent after this card filed, which pulled task175 into the live window and fired ban.role
on finance_controller; the stakeholder is redrawn as the head of the payroll-deduction lending portfolio
(portfolio_manager) and the golden note is written from that unit. Pack unchanged (target.zip 2db9de82); heart WARN.

Co-Authored-By: Claude Opus 5.5 <noreply@anthropic.com>
Claude-Session: https://claude.ai/code/session_01A6XcFx5t62c7gPi1bBKcVi
</commit_message>
<xml_diff>
--- a/task177/golden/launch_default_note.docx
+++ b/task177/golden/launch_default_note.docx
@@ -35,7 +35,7 @@
         <w:rPr>
           <w:sz w:val="19"/>
         </w:rPr>
-        <w:t>Paola Ayala, Finance</w:t>
+        <w:t>Paola Ayala, Libranza Portfolio</w:t>
       </w:r>
     </w:p>
     <w:p>
@@ -194,7 +194,7 @@
       <w:rPr>
         <w:sz w:val="16"/>
       </w:rPr>
-      <w:t xml:space="preserve">Coopservir. Finance. Internal. Page </w:t>
+      <w:t xml:space="preserve">Coopservir. Libranza Portfolio. Internal. Page </w:t>
     </w:r>
     <w:fldSimple w:instr="PAGE">
       <w:r>

</xml_diff>